<commit_message>
Epic 3 - Artem Nechai
</commit_message>
<xml_diff>
--- a/ai_12/artem_nechai/epic_3/epic_3_report_artem_nechai.docx
+++ b/ai_12/artem_nechai/epic_3/epic_3_report_artem_nechai.docx
@@ -104,12 +104,12 @@
             <wp:extent cx="2710845" cy="2571750"/>
             <wp:effectExtent b="0" l="0" r="0" t="0"/>
             <wp:wrapNone/>
-            <wp:docPr descr="A blue and white logo&#10;&#10;Description automatically generated" id="22" name="image15.jpg"/>
+            <wp:docPr descr="A blue and white logo&#10;&#10;Description automatically generated" id="25" name="image22.jpg"/>
             <a:graphic>
               <a:graphicData uri="http://schemas.openxmlformats.org/drawingml/2006/picture">
                 <pic:pic>
                   <pic:nvPicPr>
-                    <pic:cNvPr descr="A blue and white logo&#10;&#10;Description automatically generated" id="0" name="image15.jpg"/>
+                    <pic:cNvPr descr="A blue and white logo&#10;&#10;Description automatically generated" id="0" name="image22.jpg"/>
                     <pic:cNvPicPr preferRelativeResize="0"/>
                   </pic:nvPicPr>
                   <pic:blipFill>
@@ -1720,12 +1720,12 @@
           <wp:inline distB="114300" distT="114300" distL="114300" distR="114300">
             <wp:extent cx="4414838" cy="818163"/>
             <wp:effectExtent b="0" l="0" r="0" t="0"/>
-            <wp:docPr id="5" name="image22.png"/>
+            <wp:docPr id="5" name="image2.png"/>
             <a:graphic>
               <a:graphicData uri="http://schemas.openxmlformats.org/drawingml/2006/picture">
                 <pic:pic>
                   <pic:nvPicPr>
-                    <pic:cNvPr id="0" name="image22.png"/>
+                    <pic:cNvPr id="0" name="image2.png"/>
                     <pic:cNvPicPr preferRelativeResize="0"/>
                   </pic:nvPicPr>
                   <pic:blipFill>
@@ -1934,12 +1934,12 @@
           <wp:inline distB="114300" distT="114300" distL="114300" distR="114300">
             <wp:extent cx="5731200" cy="508000"/>
             <wp:effectExtent b="0" l="0" r="0" t="0"/>
-            <wp:docPr id="15" name="image1.png"/>
+            <wp:docPr id="16" name="image14.png"/>
             <a:graphic>
               <a:graphicData uri="http://schemas.openxmlformats.org/drawingml/2006/picture">
                 <pic:pic>
                   <pic:nvPicPr>
-                    <pic:cNvPr id="0" name="image1.png"/>
+                    <pic:cNvPr id="0" name="image14.png"/>
                     <pic:cNvPicPr preferRelativeResize="0"/>
                   </pic:nvPicPr>
                   <pic:blipFill>
@@ -2465,12 +2465,12 @@
           <wp:inline distB="114300" distT="114300" distL="114300" distR="114300">
             <wp:extent cx="4953000" cy="6772275"/>
             <wp:effectExtent b="0" l="0" r="0" t="0"/>
-            <wp:docPr id="23" name="image23.png"/>
+            <wp:docPr id="26" name="image21.png"/>
             <a:graphic>
               <a:graphicData uri="http://schemas.openxmlformats.org/drawingml/2006/picture">
                 <pic:pic>
                   <pic:nvPicPr>
-                    <pic:cNvPr id="0" name="image23.png"/>
+                    <pic:cNvPr id="0" name="image21.png"/>
                     <pic:cNvPicPr preferRelativeResize="0"/>
                   </pic:nvPicPr>
                   <pic:blipFill>
@@ -2542,12 +2542,12 @@
           <wp:inline distB="114300" distT="114300" distL="114300" distR="114300">
             <wp:extent cx="5257800" cy="5019675"/>
             <wp:effectExtent b="0" l="0" r="0" t="0"/>
-            <wp:docPr id="17" name="image2.png"/>
+            <wp:docPr id="19" name="image8.png"/>
             <a:graphic>
               <a:graphicData uri="http://schemas.openxmlformats.org/drawingml/2006/picture">
                 <pic:pic>
                   <pic:nvPicPr>
-                    <pic:cNvPr id="0" name="image2.png"/>
+                    <pic:cNvPr id="0" name="image8.png"/>
                     <pic:cNvPicPr preferRelativeResize="0"/>
                   </pic:nvPicPr>
                   <pic:blipFill>
@@ -2619,12 +2619,12 @@
           <wp:inline distB="114300" distT="114300" distL="114300" distR="114300">
             <wp:extent cx="4429125" cy="7496175"/>
             <wp:effectExtent b="0" l="0" r="0" t="0"/>
-            <wp:docPr id="10" name="image12.png"/>
+            <wp:docPr id="10" name="image24.png"/>
             <a:graphic>
               <a:graphicData uri="http://schemas.openxmlformats.org/drawingml/2006/picture">
                 <pic:pic>
                   <pic:nvPicPr>
-                    <pic:cNvPr id="0" name="image12.png"/>
+                    <pic:cNvPr id="0" name="image24.png"/>
                     <pic:cNvPicPr preferRelativeResize="0"/>
                   </pic:nvPicPr>
                   <pic:blipFill>
@@ -2696,12 +2696,12 @@
           <wp:inline distB="114300" distT="114300" distL="114300" distR="114300">
             <wp:extent cx="5731200" cy="6375400"/>
             <wp:effectExtent b="0" l="0" r="0" t="0"/>
-            <wp:docPr id="12" name="image13.png"/>
+            <wp:docPr id="13" name="image4.png"/>
             <a:graphic>
               <a:graphicData uri="http://schemas.openxmlformats.org/drawingml/2006/picture">
                 <pic:pic>
                   <pic:nvPicPr>
-                    <pic:cNvPr id="0" name="image13.png"/>
+                    <pic:cNvPr id="0" name="image4.png"/>
                     <pic:cNvPicPr preferRelativeResize="0"/>
                   </pic:nvPicPr>
                   <pic:blipFill>
@@ -2773,12 +2773,12 @@
           <wp:inline distB="114300" distT="114300" distL="114300" distR="114300">
             <wp:extent cx="3924300" cy="4305300"/>
             <wp:effectExtent b="0" l="0" r="0" t="0"/>
-            <wp:docPr id="21" name="image17.png"/>
+            <wp:docPr id="23" name="image27.png"/>
             <a:graphic>
               <a:graphicData uri="http://schemas.openxmlformats.org/drawingml/2006/picture">
                 <pic:pic>
                   <pic:nvPicPr>
-                    <pic:cNvPr id="0" name="image17.png"/>
+                    <pic:cNvPr id="0" name="image27.png"/>
                     <pic:cNvPicPr preferRelativeResize="0"/>
                   </pic:nvPicPr>
                   <pic:blipFill>
@@ -2927,12 +2927,12 @@
           <wp:inline distB="114300" distT="114300" distL="114300" distR="114300">
             <wp:extent cx="5731200" cy="5715000"/>
             <wp:effectExtent b="0" l="0" r="0" t="0"/>
-            <wp:docPr id="11" name="image5.png"/>
+            <wp:docPr id="12" name="image15.png"/>
             <a:graphic>
               <a:graphicData uri="http://schemas.openxmlformats.org/drawingml/2006/picture">
                 <pic:pic>
                   <pic:nvPicPr>
-                    <pic:cNvPr id="0" name="image5.png"/>
+                    <pic:cNvPr id="0" name="image15.png"/>
                     <pic:cNvPicPr preferRelativeResize="0"/>
                   </pic:nvPicPr>
                   <pic:blipFill>
@@ -2987,12 +2987,12 @@
           <wp:inline distB="114300" distT="114300" distL="114300" distR="114300">
             <wp:extent cx="3076575" cy="3971925"/>
             <wp:effectExtent b="0" l="0" r="0" t="0"/>
-            <wp:docPr id="3" name="image8.png"/>
+            <wp:docPr id="3" name="image3.png"/>
             <a:graphic>
               <a:graphicData uri="http://schemas.openxmlformats.org/drawingml/2006/picture">
                 <pic:pic>
                   <pic:nvPicPr>
-                    <pic:cNvPr id="0" name="image8.png"/>
+                    <pic:cNvPr id="0" name="image3.png"/>
                     <pic:cNvPicPr preferRelativeResize="0"/>
                   </pic:nvPicPr>
                   <pic:blipFill>
@@ -3081,12 +3081,12 @@
           <wp:inline distB="114300" distT="114300" distL="114300" distR="114300">
             <wp:extent cx="3495675" cy="7353300"/>
             <wp:effectExtent b="0" l="0" r="0" t="0"/>
-            <wp:docPr id="16" name="image10.png"/>
+            <wp:docPr id="17" name="image13.png"/>
             <a:graphic>
               <a:graphicData uri="http://schemas.openxmlformats.org/drawingml/2006/picture">
                 <pic:pic>
                   <pic:nvPicPr>
-                    <pic:cNvPr id="0" name="image10.png"/>
+                    <pic:cNvPr id="0" name="image13.png"/>
                     <pic:cNvPicPr preferRelativeResize="0"/>
                   </pic:nvPicPr>
                   <pic:blipFill>
@@ -3158,12 +3158,12 @@
           <wp:inline distB="114300" distT="114300" distL="114300" distR="114300">
             <wp:extent cx="3829050" cy="4629150"/>
             <wp:effectExtent b="0" l="0" r="0" t="0"/>
-            <wp:docPr id="4" name="image21.png"/>
+            <wp:docPr id="4" name="image20.png"/>
             <a:graphic>
               <a:graphicData uri="http://schemas.openxmlformats.org/drawingml/2006/picture">
                 <pic:pic>
                   <pic:nvPicPr>
-                    <pic:cNvPr id="0" name="image21.png"/>
+                    <pic:cNvPr id="0" name="image20.png"/>
                     <pic:cNvPicPr preferRelativeResize="0"/>
                   </pic:nvPicPr>
                   <pic:blipFill>
@@ -3235,12 +3235,12 @@
           <wp:inline distB="114300" distT="114300" distL="114300" distR="114300">
             <wp:extent cx="5629275" cy="6210300"/>
             <wp:effectExtent b="0" l="0" r="0" t="0"/>
-            <wp:docPr id="2" name="image11.png"/>
+            <wp:docPr id="2" name="image1.png"/>
             <a:graphic>
               <a:graphicData uri="http://schemas.openxmlformats.org/drawingml/2006/picture">
                 <pic:pic>
                   <pic:nvPicPr>
-                    <pic:cNvPr id="0" name="image11.png"/>
+                    <pic:cNvPr id="0" name="image1.png"/>
                     <pic:cNvPicPr preferRelativeResize="0"/>
                   </pic:nvPicPr>
                   <pic:blipFill>
@@ -3312,12 +3312,12 @@
           <wp:inline distB="114300" distT="114300" distL="114300" distR="114300">
             <wp:extent cx="4210050" cy="7505700"/>
             <wp:effectExtent b="0" l="0" r="0" t="0"/>
-            <wp:docPr id="8" name="image16.png"/>
+            <wp:docPr id="8" name="image7.png"/>
             <a:graphic>
               <a:graphicData uri="http://schemas.openxmlformats.org/drawingml/2006/picture">
                 <pic:pic>
                   <pic:nvPicPr>
-                    <pic:cNvPr id="0" name="image16.png"/>
+                    <pic:cNvPr id="0" name="image7.png"/>
                     <pic:cNvPicPr preferRelativeResize="0"/>
                   </pic:nvPicPr>
                   <pic:blipFill>
@@ -3389,12 +3389,12 @@
           <wp:inline distB="114300" distT="114300" distL="114300" distR="114300">
             <wp:extent cx="4067175" cy="6762750"/>
             <wp:effectExtent b="0" l="0" r="0" t="0"/>
-            <wp:docPr id="25" name="image19.png"/>
+            <wp:docPr id="31" name="image26.png"/>
             <a:graphic>
               <a:graphicData uri="http://schemas.openxmlformats.org/drawingml/2006/picture">
                 <pic:pic>
                   <pic:nvPicPr>
-                    <pic:cNvPr id="0" name="image19.png"/>
+                    <pic:cNvPr id="0" name="image26.png"/>
                     <pic:cNvPicPr preferRelativeResize="0"/>
                   </pic:nvPicPr>
                   <pic:blipFill>
@@ -3466,12 +3466,12 @@
           <wp:inline distB="114300" distT="114300" distL="114300" distR="114300">
             <wp:extent cx="3771900" cy="7629525"/>
             <wp:effectExtent b="0" l="0" r="0" t="0"/>
-            <wp:docPr id="9" name="image6.png"/>
+            <wp:docPr id="9" name="image11.png"/>
             <a:graphic>
               <a:graphicData uri="http://schemas.openxmlformats.org/drawingml/2006/picture">
                 <pic:pic>
                   <pic:nvPicPr>
-                    <pic:cNvPr id="0" name="image6.png"/>
+                    <pic:cNvPr id="0" name="image11.png"/>
                     <pic:cNvPicPr preferRelativeResize="0"/>
                   </pic:nvPicPr>
                   <pic:blipFill>
@@ -3577,7 +3577,7 @@
           <w:szCs w:val="24"/>
           <w:rtl w:val="0"/>
         </w:rPr>
-        <w:t xml:space="preserve">Планований час на реалізацію: 3 години</w:t>
+        <w:t xml:space="preserve">Планований час на реалізацію: 4 години</w:t>
       </w:r>
       <w:r>
         <w:rPr>
@@ -3762,12 +3762,12 @@
           <wp:inline distB="114300" distT="114300" distL="114300" distR="114300">
             <wp:extent cx="4616288" cy="6031211"/>
             <wp:effectExtent b="0" l="0" r="0" t="0"/>
-            <wp:docPr id="19" name="image14.png"/>
+            <wp:docPr id="21" name="image18.png"/>
             <a:graphic>
               <a:graphicData uri="http://schemas.openxmlformats.org/drawingml/2006/picture">
                 <pic:pic>
                   <pic:nvPicPr>
-                    <pic:cNvPr id="0" name="image14.png"/>
+                    <pic:cNvPr id="0" name="image18.png"/>
                     <pic:cNvPicPr preferRelativeResize="0"/>
                   </pic:nvPicPr>
                   <pic:blipFill>
@@ -3878,7 +3878,6 @@
           <w:rFonts w:ascii="Times New Roman" w:cs="Times New Roman" w:eastAsia="Times New Roman" w:hAnsi="Times New Roman"/>
           <w:sz w:val="24"/>
           <w:szCs w:val="24"/>
-          <w:shd w:fill="ffd966" w:val="clear"/>
         </w:rPr>
       </w:pPr>
       <w:r>
@@ -3901,22 +3900,19 @@
         </w:rPr>
         <w:t xml:space="preserve">: </w:t>
       </w:r>
-      <w:r>
-        <w:rPr>
-          <w:rtl w:val="0"/>
-        </w:rPr>
-      </w:r>
-    </w:p>
-    <w:p>
-      <w:pPr>
-        <w:spacing w:after="200" w:line="276" w:lineRule="auto"/>
-        <w:rPr>
-          <w:rFonts w:ascii="Times New Roman" w:cs="Times New Roman" w:eastAsia="Times New Roman" w:hAnsi="Times New Roman"/>
-          <w:sz w:val="24"/>
-          <w:szCs w:val="24"/>
-          <w:shd w:fill="ffd966" w:val="clear"/>
-        </w:rPr>
-      </w:pPr>
+      <w:hyperlink r:id="rId27">
+        <w:r>
+          <w:rPr>
+            <w:rFonts w:ascii="Times New Roman" w:cs="Times New Roman" w:eastAsia="Times New Roman" w:hAnsi="Times New Roman"/>
+            <w:color w:val="1155cc"/>
+            <w:sz w:val="24"/>
+            <w:szCs w:val="24"/>
+            <w:u w:val="single"/>
+            <w:rtl w:val="0"/>
+          </w:rPr>
+          <w:t xml:space="preserve">https://github.com/artificial-intelligence-department/ai_programming_playground_2026/pull/468/changes#diff-b6419cfe3c5e634723f9e9ce6a21c00aed2d1cb1b948960e12637d6dc071da69</w:t>
+        </w:r>
+      </w:hyperlink>
       <w:r>
         <w:rPr>
           <w:rtl w:val="0"/>
@@ -3962,16 +3958,16 @@
           <wp:inline distB="114300" distT="114300" distL="114300" distR="114300">
             <wp:extent cx="4984213" cy="5919788"/>
             <wp:effectExtent b="0" l="0" r="0" t="0"/>
-            <wp:docPr id="14" name="image4.png"/>
+            <wp:docPr id="15" name="image12.png"/>
             <a:graphic>
               <a:graphicData uri="http://schemas.openxmlformats.org/drawingml/2006/picture">
                 <pic:pic>
                   <pic:nvPicPr>
-                    <pic:cNvPr id="0" name="image4.png"/>
+                    <pic:cNvPr id="0" name="image12.png"/>
                     <pic:cNvPicPr preferRelativeResize="0"/>
                   </pic:nvPicPr>
                   <pic:blipFill>
-                    <a:blip r:embed="rId27"/>
+                    <a:blip r:embed="rId28"/>
                     <a:srcRect b="0" l="0" r="0" t="0"/>
                     <a:stretch>
                       <a:fillRect/>
@@ -4017,16 +4013,16 @@
           <wp:inline distB="114300" distT="114300" distL="114300" distR="114300">
             <wp:extent cx="5091113" cy="5150311"/>
             <wp:effectExtent b="0" l="0" r="0" t="0"/>
-            <wp:docPr id="24" name="image24.png"/>
+            <wp:docPr id="28" name="image29.png"/>
             <a:graphic>
               <a:graphicData uri="http://schemas.openxmlformats.org/drawingml/2006/picture">
                 <pic:pic>
                   <pic:nvPicPr>
-                    <pic:cNvPr id="0" name="image24.png"/>
+                    <pic:cNvPr id="0" name="image29.png"/>
                     <pic:cNvPicPr preferRelativeResize="0"/>
                   </pic:nvPicPr>
                   <pic:blipFill>
-                    <a:blip r:embed="rId28"/>
+                    <a:blip r:embed="rId29"/>
                     <a:srcRect b="0" l="0" r="0" t="0"/>
                     <a:stretch>
                       <a:fillRect/>
@@ -4107,7 +4103,7 @@
         </w:rPr>
         <w:t xml:space="preserve">Посилання на github: </w:t>
       </w:r>
-      <w:hyperlink r:id="rId29">
+      <w:hyperlink r:id="rId30">
         <w:r>
           <w:rPr>
             <w:rFonts w:ascii="Times New Roman" w:cs="Times New Roman" w:eastAsia="Times New Roman" w:hAnsi="Times New Roman"/>
@@ -4156,6 +4152,238 @@
         </w:rPr>
         <w:t xml:space="preserve">: </w:t>
       </w:r>
+      <w:hyperlink r:id="rId31">
+        <w:r>
+          <w:rPr>
+            <w:rFonts w:ascii="Times New Roman" w:cs="Times New Roman" w:eastAsia="Times New Roman" w:hAnsi="Times New Roman"/>
+            <w:color w:val="1155cc"/>
+            <w:sz w:val="24"/>
+            <w:szCs w:val="24"/>
+            <w:u w:val="single"/>
+            <w:rtl w:val="0"/>
+          </w:rPr>
+          <w:t xml:space="preserve">https://github.com/artificial-intelligence-department/ai_programming_playground_2026/pull/468/changes#diff-7914dc0b238a8f31e9045bee0743fdc848b8ceecce548a22d712907703d37a67</w:t>
+        </w:r>
+      </w:hyperlink>
+      <w:r>
+        <w:rPr>
+          <w:rtl w:val="0"/>
+        </w:rPr>
+      </w:r>
+    </w:p>
+    <w:p>
+      <w:pPr>
+        <w:spacing w:line="240" w:lineRule="auto"/>
+        <w:ind w:left="720" w:firstLine="0"/>
+        <w:rPr>
+          <w:rFonts w:ascii="Times New Roman" w:cs="Times New Roman" w:eastAsia="Times New Roman" w:hAnsi="Times New Roman"/>
+          <w:sz w:val="24"/>
+          <w:szCs w:val="24"/>
+        </w:rPr>
+      </w:pPr>
+      <w:r>
+        <w:rPr>
+          <w:rtl w:val="0"/>
+        </w:rPr>
+      </w:r>
+    </w:p>
+    <w:p>
+      <w:pPr>
+        <w:spacing w:line="276" w:lineRule="auto"/>
+        <w:rPr>
+          <w:rFonts w:ascii="Times New Roman" w:cs="Times New Roman" w:eastAsia="Times New Roman" w:hAnsi="Times New Roman"/>
+          <w:sz w:val="24"/>
+          <w:szCs w:val="24"/>
+        </w:rPr>
+      </w:pPr>
+      <w:r>
+        <w:rPr>
+          <w:rFonts w:ascii="Times New Roman" w:cs="Times New Roman" w:eastAsia="Times New Roman" w:hAnsi="Times New Roman"/>
+          <w:sz w:val="24"/>
+          <w:szCs w:val="24"/>
+          <w:rtl w:val="0"/>
+        </w:rPr>
+        <w:t xml:space="preserve">Завдання №3 Practice# programming: Class Practice Task</w:t>
+      </w:r>
+    </w:p>
+    <w:p>
+      <w:pPr>
+        <w:spacing w:line="276" w:lineRule="auto"/>
+        <w:jc w:val="center"/>
+        <w:rPr>
+          <w:rFonts w:ascii="Times New Roman" w:cs="Times New Roman" w:eastAsia="Times New Roman" w:hAnsi="Times New Roman"/>
+          <w:sz w:val="24"/>
+          <w:szCs w:val="24"/>
+        </w:rPr>
+      </w:pPr>
+      <w:r>
+        <w:rPr>
+          <w:rFonts w:ascii="Times New Roman" w:cs="Times New Roman" w:eastAsia="Times New Roman" w:hAnsi="Times New Roman"/>
+          <w:sz w:val="24"/>
+          <w:szCs w:val="24"/>
+        </w:rPr>
+        <w:drawing>
+          <wp:inline distB="114300" distT="114300" distL="114300" distR="114300">
+            <wp:extent cx="4697590" cy="4338638"/>
+            <wp:effectExtent b="0" l="0" r="0" t="0"/>
+            <wp:docPr id="24" name="image19.png"/>
+            <a:graphic>
+              <a:graphicData uri="http://schemas.openxmlformats.org/drawingml/2006/picture">
+                <pic:pic>
+                  <pic:nvPicPr>
+                    <pic:cNvPr id="0" name="image19.png"/>
+                    <pic:cNvPicPr preferRelativeResize="0"/>
+                  </pic:nvPicPr>
+                  <pic:blipFill>
+                    <a:blip r:embed="rId32"/>
+                    <a:srcRect b="0" l="0" r="0" t="0"/>
+                    <a:stretch>
+                      <a:fillRect/>
+                    </a:stretch>
+                  </pic:blipFill>
+                  <pic:spPr>
+                    <a:xfrm>
+                      <a:off x="0" y="0"/>
+                      <a:ext cx="4697590" cy="4338638"/>
+                    </a:xfrm>
+                    <a:prstGeom prst="rect"/>
+                    <a:ln/>
+                  </pic:spPr>
+                </pic:pic>
+              </a:graphicData>
+            </a:graphic>
+          </wp:inline>
+        </w:drawing>
+      </w:r>
+      <w:r>
+        <w:rPr>
+          <w:rtl w:val="0"/>
+        </w:rPr>
+      </w:r>
+    </w:p>
+    <w:p>
+      <w:pPr>
+        <w:spacing w:line="276" w:lineRule="auto"/>
+        <w:jc w:val="center"/>
+        <w:rPr>
+          <w:rFonts w:ascii="Times New Roman" w:cs="Times New Roman" w:eastAsia="Times New Roman" w:hAnsi="Times New Roman"/>
+          <w:sz w:val="24"/>
+          <w:szCs w:val="24"/>
+        </w:rPr>
+      </w:pPr>
+      <w:r>
+        <w:rPr>
+          <w:rFonts w:ascii="Times New Roman" w:cs="Times New Roman" w:eastAsia="Times New Roman" w:hAnsi="Times New Roman"/>
+          <w:sz w:val="24"/>
+          <w:szCs w:val="24"/>
+        </w:rPr>
+        <w:drawing>
+          <wp:inline distB="114300" distT="114300" distL="114300" distR="114300">
+            <wp:extent cx="4868700" cy="4969558"/>
+            <wp:effectExtent b="0" l="0" r="0" t="0"/>
+            <wp:docPr id="18" name="image10.png"/>
+            <a:graphic>
+              <a:graphicData uri="http://schemas.openxmlformats.org/drawingml/2006/picture">
+                <pic:pic>
+                  <pic:nvPicPr>
+                    <pic:cNvPr id="0" name="image10.png"/>
+                    <pic:cNvPicPr preferRelativeResize="0"/>
+                  </pic:nvPicPr>
+                  <pic:blipFill>
+                    <a:blip r:embed="rId33"/>
+                    <a:srcRect b="0" l="0" r="0" t="0"/>
+                    <a:stretch>
+                      <a:fillRect/>
+                    </a:stretch>
+                  </pic:blipFill>
+                  <pic:spPr>
+                    <a:xfrm>
+                      <a:off x="0" y="0"/>
+                      <a:ext cx="4868700" cy="4969558"/>
+                    </a:xfrm>
+                    <a:prstGeom prst="rect"/>
+                    <a:ln/>
+                  </pic:spPr>
+                </pic:pic>
+              </a:graphicData>
+            </a:graphic>
+          </wp:inline>
+        </w:drawing>
+      </w:r>
+      <w:r>
+        <w:rPr>
+          <w:rtl w:val="0"/>
+        </w:rPr>
+      </w:r>
+    </w:p>
+    <w:p>
+      <w:pPr>
+        <w:spacing w:line="276" w:lineRule="auto"/>
+        <w:jc w:val="center"/>
+        <w:rPr>
+          <w:rFonts w:ascii="Times New Roman" w:cs="Times New Roman" w:eastAsia="Times New Roman" w:hAnsi="Times New Roman"/>
+          <w:sz w:val="24"/>
+          <w:szCs w:val="24"/>
+        </w:rPr>
+      </w:pPr>
+      <w:r>
+        <w:rPr>
+          <w:rFonts w:ascii="Times New Roman" w:cs="Times New Roman" w:eastAsia="Times New Roman" w:hAnsi="Times New Roman"/>
+          <w:sz w:val="24"/>
+          <w:szCs w:val="24"/>
+          <w:rtl w:val="0"/>
+        </w:rPr>
+        <w:t xml:space="preserve">Рис.4. Код програми Аналізатор місячного бюджету</w:t>
+      </w:r>
+    </w:p>
+    <w:p>
+      <w:pPr>
+        <w:spacing w:line="276" w:lineRule="auto"/>
+        <w:jc w:val="center"/>
+        <w:rPr>
+          <w:rFonts w:ascii="Times New Roman" w:cs="Times New Roman" w:eastAsia="Times New Roman" w:hAnsi="Times New Roman"/>
+          <w:sz w:val="24"/>
+          <w:szCs w:val="24"/>
+        </w:rPr>
+      </w:pPr>
+      <w:r>
+        <w:rPr>
+          <w:rtl w:val="0"/>
+        </w:rPr>
+      </w:r>
+    </w:p>
+    <w:p>
+      <w:pPr>
+        <w:spacing w:line="276" w:lineRule="auto"/>
+        <w:rPr>
+          <w:rFonts w:ascii="Times New Roman" w:cs="Times New Roman" w:eastAsia="Times New Roman" w:hAnsi="Times New Roman"/>
+          <w:sz w:val="24"/>
+          <w:szCs w:val="24"/>
+          <w:shd w:fill="fff2cc" w:val="clear"/>
+        </w:rPr>
+      </w:pPr>
+      <w:r>
+        <w:rPr>
+          <w:rFonts w:ascii="Times New Roman" w:cs="Times New Roman" w:eastAsia="Times New Roman" w:hAnsi="Times New Roman"/>
+          <w:sz w:val="24"/>
+          <w:szCs w:val="24"/>
+          <w:rtl w:val="0"/>
+        </w:rPr>
+        <w:t xml:space="preserve">Посилання на github: </w:t>
+      </w:r>
+      <w:hyperlink r:id="rId34">
+        <w:r>
+          <w:rPr>
+            <w:rFonts w:ascii="Times New Roman" w:cs="Times New Roman" w:eastAsia="Times New Roman" w:hAnsi="Times New Roman"/>
+            <w:color w:val="1155cc"/>
+            <w:sz w:val="24"/>
+            <w:szCs w:val="24"/>
+            <w:u w:val="single"/>
+            <w:rtl w:val="0"/>
+          </w:rPr>
+          <w:t xml:space="preserve">https://github.com/Nechosart/Epic3/blob/main/practice_task.cpp</w:t>
+        </w:r>
+      </w:hyperlink>
       <w:r>
         <w:rPr>
           <w:rtl w:val="0"/>
@@ -4171,6 +4399,325 @@
           <w:szCs w:val="24"/>
         </w:rPr>
       </w:pPr>
+      <w:r>
+        <w:rPr>
+          <w:rFonts w:ascii="Times New Roman" w:cs="Times New Roman" w:eastAsia="Times New Roman" w:hAnsi="Times New Roman"/>
+          <w:i w:val="1"/>
+          <w:iCs w:val="1"/>
+          <w:sz w:val="24"/>
+          <w:szCs w:val="24"/>
+          <w:rtl w:val="0"/>
+        </w:rPr>
+        <w:t xml:space="preserve">Посилання на файл коду в пулреквесті</w:t>
+      </w:r>
+      <w:r>
+        <w:rPr>
+          <w:rFonts w:ascii="Times New Roman" w:cs="Times New Roman" w:eastAsia="Times New Roman" w:hAnsi="Times New Roman"/>
+          <w:sz w:val="24"/>
+          <w:szCs w:val="24"/>
+          <w:rtl w:val="0"/>
+        </w:rPr>
+        <w:t xml:space="preserve">: </w:t>
+      </w:r>
+    </w:p>
+    <w:p>
+      <w:pPr>
+        <w:spacing w:after="200" w:line="276" w:lineRule="auto"/>
+        <w:rPr>
+          <w:rFonts w:ascii="Times New Roman" w:cs="Times New Roman" w:eastAsia="Times New Roman" w:hAnsi="Times New Roman"/>
+          <w:sz w:val="24"/>
+          <w:szCs w:val="24"/>
+        </w:rPr>
+      </w:pPr>
+      <w:hyperlink r:id="rId35">
+        <w:r>
+          <w:rPr>
+            <w:rFonts w:ascii="Times New Roman" w:cs="Times New Roman" w:eastAsia="Times New Roman" w:hAnsi="Times New Roman"/>
+            <w:color w:val="1155cc"/>
+            <w:sz w:val="24"/>
+            <w:szCs w:val="24"/>
+            <w:u w:val="single"/>
+            <w:rtl w:val="0"/>
+          </w:rPr>
+          <w:t xml:space="preserve">https://github.com/artificial-intelligence-department/ai_programming_playground_2026/pull/468/changes#diff-4f0315feeeca64ad74f668d5fa924ebef2d66c4ae3bfac6c3936d1eadd34b703</w:t>
+        </w:r>
+      </w:hyperlink>
+      <w:r>
+        <w:rPr>
+          <w:rtl w:val="0"/>
+        </w:rPr>
+      </w:r>
+    </w:p>
+    <w:p>
+      <w:pPr>
+        <w:spacing w:after="200" w:line="276" w:lineRule="auto"/>
+        <w:rPr>
+          <w:rFonts w:ascii="Times New Roman" w:cs="Times New Roman" w:eastAsia="Times New Roman" w:hAnsi="Times New Roman"/>
+          <w:sz w:val="24"/>
+          <w:szCs w:val="24"/>
+        </w:rPr>
+      </w:pPr>
+      <w:r>
+        <w:rPr>
+          <w:rtl w:val="0"/>
+        </w:rPr>
+      </w:r>
+    </w:p>
+    <w:p>
+      <w:pPr>
+        <w:spacing w:line="276" w:lineRule="auto"/>
+        <w:rPr>
+          <w:rFonts w:ascii="Times New Roman" w:cs="Times New Roman" w:eastAsia="Times New Roman" w:hAnsi="Times New Roman"/>
+          <w:sz w:val="24"/>
+          <w:szCs w:val="24"/>
+        </w:rPr>
+      </w:pPr>
+      <w:r>
+        <w:rPr>
+          <w:rFonts w:ascii="Times New Roman" w:cs="Times New Roman" w:eastAsia="Times New Roman" w:hAnsi="Times New Roman"/>
+          <w:sz w:val="24"/>
+          <w:szCs w:val="24"/>
+          <w:rtl w:val="0"/>
+        </w:rPr>
+        <w:t xml:space="preserve">Завдання №4 Practice# programming:  Self Practice Task</w:t>
+      </w:r>
+    </w:p>
+    <w:p>
+      <w:pPr>
+        <w:spacing w:after="200" w:line="276" w:lineRule="auto"/>
+        <w:jc w:val="center"/>
+        <w:rPr>
+          <w:rFonts w:ascii="Times New Roman" w:cs="Times New Roman" w:eastAsia="Times New Roman" w:hAnsi="Times New Roman"/>
+          <w:sz w:val="24"/>
+          <w:szCs w:val="24"/>
+        </w:rPr>
+      </w:pPr>
+      <w:r>
+        <w:rPr>
+          <w:rFonts w:ascii="Times New Roman" w:cs="Times New Roman" w:eastAsia="Times New Roman" w:hAnsi="Times New Roman"/>
+          <w:sz w:val="24"/>
+          <w:szCs w:val="24"/>
+        </w:rPr>
+        <w:drawing>
+          <wp:inline distB="114300" distT="114300" distL="114300" distR="114300">
+            <wp:extent cx="3405697" cy="4614863"/>
+            <wp:effectExtent b="0" l="0" r="0" t="0"/>
+            <wp:docPr id="29" name="image23.png"/>
+            <a:graphic>
+              <a:graphicData uri="http://schemas.openxmlformats.org/drawingml/2006/picture">
+                <pic:pic>
+                  <pic:nvPicPr>
+                    <pic:cNvPr id="0" name="image23.png"/>
+                    <pic:cNvPicPr preferRelativeResize="0"/>
+                  </pic:nvPicPr>
+                  <pic:blipFill>
+                    <a:blip r:embed="rId36"/>
+                    <a:srcRect b="0" l="0" r="0" t="0"/>
+                    <a:stretch>
+                      <a:fillRect/>
+                    </a:stretch>
+                  </pic:blipFill>
+                  <pic:spPr>
+                    <a:xfrm>
+                      <a:off x="0" y="0"/>
+                      <a:ext cx="3405697" cy="4614863"/>
+                    </a:xfrm>
+                    <a:prstGeom prst="rect"/>
+                    <a:ln/>
+                  </pic:spPr>
+                </pic:pic>
+              </a:graphicData>
+            </a:graphic>
+          </wp:inline>
+        </w:drawing>
+      </w:r>
+      <w:r>
+        <w:rPr>
+          <w:rtl w:val="0"/>
+        </w:rPr>
+      </w:r>
+    </w:p>
+    <w:p>
+      <w:pPr>
+        <w:spacing w:after="200" w:line="276" w:lineRule="auto"/>
+        <w:jc w:val="center"/>
+        <w:rPr>
+          <w:rFonts w:ascii="Times New Roman" w:cs="Times New Roman" w:eastAsia="Times New Roman" w:hAnsi="Times New Roman"/>
+          <w:sz w:val="24"/>
+          <w:szCs w:val="24"/>
+        </w:rPr>
+      </w:pPr>
+      <w:r>
+        <w:rPr>
+          <w:rFonts w:ascii="Times New Roman" w:cs="Times New Roman" w:eastAsia="Times New Roman" w:hAnsi="Times New Roman"/>
+          <w:sz w:val="24"/>
+          <w:szCs w:val="24"/>
+        </w:rPr>
+        <w:drawing>
+          <wp:inline distB="114300" distT="114300" distL="114300" distR="114300">
+            <wp:extent cx="3071813" cy="2303859"/>
+            <wp:effectExtent b="0" l="0" r="0" t="0"/>
+            <wp:docPr id="11" name="image5.png"/>
+            <a:graphic>
+              <a:graphicData uri="http://schemas.openxmlformats.org/drawingml/2006/picture">
+                <pic:pic>
+                  <pic:nvPicPr>
+                    <pic:cNvPr id="0" name="image5.png"/>
+                    <pic:cNvPicPr preferRelativeResize="0"/>
+                  </pic:nvPicPr>
+                  <pic:blipFill>
+                    <a:blip r:embed="rId37"/>
+                    <a:srcRect b="0" l="0" r="0" t="0"/>
+                    <a:stretch>
+                      <a:fillRect/>
+                    </a:stretch>
+                  </pic:blipFill>
+                  <pic:spPr>
+                    <a:xfrm>
+                      <a:off x="0" y="0"/>
+                      <a:ext cx="3071813" cy="2303859"/>
+                    </a:xfrm>
+                    <a:prstGeom prst="rect"/>
+                    <a:ln/>
+                  </pic:spPr>
+                </pic:pic>
+              </a:graphicData>
+            </a:graphic>
+          </wp:inline>
+        </w:drawing>
+      </w:r>
+      <w:r>
+        <w:rPr>
+          <w:rtl w:val="0"/>
+        </w:rPr>
+      </w:r>
+    </w:p>
+    <w:p>
+      <w:pPr>
+        <w:spacing w:line="276" w:lineRule="auto"/>
+        <w:jc w:val="center"/>
+        <w:rPr>
+          <w:rFonts w:ascii="Times New Roman" w:cs="Times New Roman" w:eastAsia="Times New Roman" w:hAnsi="Times New Roman"/>
+          <w:sz w:val="24"/>
+          <w:szCs w:val="24"/>
+        </w:rPr>
+      </w:pPr>
+      <w:r>
+        <w:rPr>
+          <w:rFonts w:ascii="Times New Roman" w:cs="Times New Roman" w:eastAsia="Times New Roman" w:hAnsi="Times New Roman"/>
+          <w:sz w:val="24"/>
+          <w:szCs w:val="24"/>
+          <w:rtl w:val="0"/>
+        </w:rPr>
+        <w:t xml:space="preserve">Рис.5. Код програми Дракон і голод</w:t>
+      </w:r>
+    </w:p>
+    <w:p>
+      <w:pPr>
+        <w:spacing w:line="276" w:lineRule="auto"/>
+        <w:jc w:val="center"/>
+        <w:rPr>
+          <w:rFonts w:ascii="Times New Roman" w:cs="Times New Roman" w:eastAsia="Times New Roman" w:hAnsi="Times New Roman"/>
+          <w:sz w:val="24"/>
+          <w:szCs w:val="24"/>
+        </w:rPr>
+      </w:pPr>
+      <w:r>
+        <w:rPr>
+          <w:rtl w:val="0"/>
+        </w:rPr>
+      </w:r>
+    </w:p>
+    <w:p>
+      <w:pPr>
+        <w:spacing w:line="276" w:lineRule="auto"/>
+        <w:rPr>
+          <w:rFonts w:ascii="Times New Roman" w:cs="Times New Roman" w:eastAsia="Times New Roman" w:hAnsi="Times New Roman"/>
+          <w:sz w:val="24"/>
+          <w:szCs w:val="24"/>
+          <w:shd w:fill="fff2cc" w:val="clear"/>
+        </w:rPr>
+      </w:pPr>
+      <w:r>
+        <w:rPr>
+          <w:rFonts w:ascii="Times New Roman" w:cs="Times New Roman" w:eastAsia="Times New Roman" w:hAnsi="Times New Roman"/>
+          <w:sz w:val="24"/>
+          <w:szCs w:val="24"/>
+          <w:rtl w:val="0"/>
+        </w:rPr>
+        <w:t xml:space="preserve">Посилання на github: </w:t>
+      </w:r>
+      <w:hyperlink r:id="rId38">
+        <w:r>
+          <w:rPr>
+            <w:rFonts w:ascii="Times New Roman" w:cs="Times New Roman" w:eastAsia="Times New Roman" w:hAnsi="Times New Roman"/>
+            <w:color w:val="1155cc"/>
+            <w:sz w:val="24"/>
+            <w:szCs w:val="24"/>
+            <w:u w:val="single"/>
+            <w:rtl w:val="0"/>
+          </w:rPr>
+          <w:t xml:space="preserve">https://algotester.com/uk/ProblemSolution/Display/2309896</w:t>
+        </w:r>
+      </w:hyperlink>
+      <w:r>
+        <w:rPr>
+          <w:rtl w:val="0"/>
+        </w:rPr>
+      </w:r>
+    </w:p>
+    <w:p>
+      <w:pPr>
+        <w:spacing w:after="200" w:line="276" w:lineRule="auto"/>
+        <w:rPr>
+          <w:rFonts w:ascii="Times New Roman" w:cs="Times New Roman" w:eastAsia="Times New Roman" w:hAnsi="Times New Roman"/>
+          <w:sz w:val="24"/>
+          <w:szCs w:val="24"/>
+        </w:rPr>
+      </w:pPr>
+      <w:r>
+        <w:rPr>
+          <w:rFonts w:ascii="Times New Roman" w:cs="Times New Roman" w:eastAsia="Times New Roman" w:hAnsi="Times New Roman"/>
+          <w:i w:val="1"/>
+          <w:iCs w:val="1"/>
+          <w:sz w:val="24"/>
+          <w:szCs w:val="24"/>
+          <w:rtl w:val="0"/>
+        </w:rPr>
+        <w:t xml:space="preserve">Посилання на файл коду в пулреквесті</w:t>
+      </w:r>
+      <w:r>
+        <w:rPr>
+          <w:rFonts w:ascii="Times New Roman" w:cs="Times New Roman" w:eastAsia="Times New Roman" w:hAnsi="Times New Roman"/>
+          <w:sz w:val="24"/>
+          <w:szCs w:val="24"/>
+          <w:rtl w:val="0"/>
+        </w:rPr>
+        <w:t xml:space="preserve">: </w:t>
+      </w:r>
+    </w:p>
+    <w:p>
+      <w:pPr>
+        <w:spacing w:after="200" w:line="276" w:lineRule="auto"/>
+        <w:rPr>
+          <w:rFonts w:ascii="Times New Roman" w:cs="Times New Roman" w:eastAsia="Times New Roman" w:hAnsi="Times New Roman"/>
+          <w:sz w:val="24"/>
+          <w:szCs w:val="24"/>
+        </w:rPr>
+      </w:pPr>
+      <w:hyperlink r:id="rId39">
+        <w:r>
+          <w:rPr>
+            <w:rFonts w:ascii="Times New Roman" w:cs="Times New Roman" w:eastAsia="Times New Roman" w:hAnsi="Times New Roman"/>
+            <w:color w:val="1155cc"/>
+            <w:sz w:val="24"/>
+            <w:szCs w:val="24"/>
+            <w:u w:val="single"/>
+            <w:rtl w:val="0"/>
+          </w:rPr>
+          <w:t xml:space="preserve">https://github.com/artificial-intelligence-department/ai_programming_playground_2026/pull/468/changes#diff-630189abeac89e339e0959636be14a6695e34b291be93e4efe168180823c093f</w:t>
+        </w:r>
+      </w:hyperlink>
       <w:r>
         <w:rPr>
           <w:rtl w:val="0"/>
@@ -4242,16 +4789,16 @@
           <wp:inline distB="114300" distT="114300" distL="114300" distR="114300">
             <wp:extent cx="2847975" cy="600075"/>
             <wp:effectExtent b="0" l="0" r="0" t="0"/>
-            <wp:docPr id="1" name="image18.png"/>
+            <wp:docPr id="1" name="image28.png"/>
             <a:graphic>
               <a:graphicData uri="http://schemas.openxmlformats.org/drawingml/2006/picture">
                 <pic:pic>
                   <pic:nvPicPr>
-                    <pic:cNvPr id="0" name="image18.png"/>
+                    <pic:cNvPr id="0" name="image28.png"/>
                     <pic:cNvPicPr preferRelativeResize="0"/>
                   </pic:nvPicPr>
                   <pic:blipFill>
-                    <a:blip r:embed="rId30"/>
+                    <a:blip r:embed="rId40"/>
                     <a:srcRect b="0" l="0" r="0" t="0"/>
                     <a:stretch>
                       <a:fillRect/>
@@ -4294,7 +4841,7 @@
           <w:szCs w:val="24"/>
           <w:rtl w:val="0"/>
         </w:rPr>
-        <w:t xml:space="preserve">Рис.4. Вивід програми Lab 2 Task 15</w:t>
+        <w:t xml:space="preserve">Рис.6. Вивід програми Lab 2 Task 15</w:t>
       </w:r>
     </w:p>
     <w:p>
@@ -4302,10 +4849,8 @@
         <w:spacing w:after="200" w:line="276" w:lineRule="auto"/>
         <w:rPr>
           <w:rFonts w:ascii="Times New Roman" w:cs="Times New Roman" w:eastAsia="Times New Roman" w:hAnsi="Times New Roman"/>
-          <w:b w:val="1"/>
-          <w:bCs w:val="1"/>
-          <w:sz w:val="26"/>
-          <w:szCs w:val="26"/>
+          <w:sz w:val="24"/>
+          <w:szCs w:val="24"/>
         </w:rPr>
       </w:pPr>
       <w:r>
@@ -4317,6 +4862,16 @@
         </w:rPr>
         <w:t xml:space="preserve">Час затрачений на виконання завдання: 1 година</w:t>
       </w:r>
+    </w:p>
+    <w:p>
+      <w:pPr>
+        <w:spacing w:after="200" w:line="276" w:lineRule="auto"/>
+        <w:rPr>
+          <w:rFonts w:ascii="Times New Roman" w:cs="Times New Roman" w:eastAsia="Times New Roman" w:hAnsi="Times New Roman"/>
+          <w:sz w:val="24"/>
+          <w:szCs w:val="24"/>
+        </w:rPr>
+      </w:pPr>
       <w:r>
         <w:rPr>
           <w:rtl w:val="0"/>
@@ -4362,16 +4917,16 @@
           <wp:inline distB="114300" distT="114300" distL="114300" distR="114300">
             <wp:extent cx="5035388" cy="1976347"/>
             <wp:effectExtent b="0" l="0" r="0" t="0"/>
-            <wp:docPr id="13" name="image25.png"/>
+            <wp:docPr id="14" name="image16.png"/>
             <a:graphic>
               <a:graphicData uri="http://schemas.openxmlformats.org/drawingml/2006/picture">
                 <pic:pic>
                   <pic:nvPicPr>
-                    <pic:cNvPr id="0" name="image25.png"/>
+                    <pic:cNvPr id="0" name="image16.png"/>
                     <pic:cNvPicPr preferRelativeResize="0"/>
                   </pic:nvPicPr>
                   <pic:blipFill>
-                    <a:blip r:embed="rId31"/>
+                    <a:blip r:embed="rId41"/>
                     <a:srcRect b="0" l="0" r="0" t="0"/>
                     <a:stretch>
                       <a:fillRect/>
@@ -4414,7 +4969,7 @@
           <w:szCs w:val="24"/>
           <w:rtl w:val="0"/>
         </w:rPr>
-        <w:t xml:space="preserve">Рис.5. Вивід програми Lab 3 Task 14</w:t>
+        <w:t xml:space="preserve">Рис.7. Вивід програми Lab 3 Task 14</w:t>
       </w:r>
     </w:p>
     <w:p>
@@ -4434,6 +4989,205 @@
           <w:rtl w:val="0"/>
         </w:rPr>
         <w:t xml:space="preserve">Час затрачений на виконання завдання: 1.5 години</w:t>
+      </w:r>
+    </w:p>
+    <w:p>
+      <w:pPr>
+        <w:spacing w:line="240" w:lineRule="auto"/>
+        <w:ind w:left="720" w:firstLine="0"/>
+        <w:rPr>
+          <w:rFonts w:ascii="Times New Roman" w:cs="Times New Roman" w:eastAsia="Times New Roman" w:hAnsi="Times New Roman"/>
+          <w:sz w:val="24"/>
+          <w:szCs w:val="24"/>
+        </w:rPr>
+      </w:pPr>
+      <w:r>
+        <w:rPr>
+          <w:rtl w:val="0"/>
+        </w:rPr>
+      </w:r>
+    </w:p>
+    <w:p>
+      <w:pPr>
+        <w:spacing w:line="276" w:lineRule="auto"/>
+        <w:rPr>
+          <w:rFonts w:ascii="Times New Roman" w:cs="Times New Roman" w:eastAsia="Times New Roman" w:hAnsi="Times New Roman"/>
+          <w:sz w:val="24"/>
+          <w:szCs w:val="24"/>
+        </w:rPr>
+      </w:pPr>
+      <w:r>
+        <w:rPr>
+          <w:rFonts w:ascii="Times New Roman" w:cs="Times New Roman" w:eastAsia="Times New Roman" w:hAnsi="Times New Roman"/>
+          <w:sz w:val="24"/>
+          <w:szCs w:val="24"/>
+          <w:rtl w:val="0"/>
+        </w:rPr>
+        <w:t xml:space="preserve">Завдання №3 Practice# programming: Class Practice Task</w:t>
+      </w:r>
+    </w:p>
+    <w:p>
+      <w:pPr>
+        <w:spacing w:line="276" w:lineRule="auto"/>
+        <w:jc w:val="center"/>
+        <w:rPr>
+          <w:rFonts w:ascii="Times New Roman" w:cs="Times New Roman" w:eastAsia="Times New Roman" w:hAnsi="Times New Roman"/>
+          <w:sz w:val="24"/>
+          <w:szCs w:val="24"/>
+        </w:rPr>
+      </w:pPr>
+      <w:r>
+        <w:rPr>
+          <w:rFonts w:ascii="Times New Roman" w:cs="Times New Roman" w:eastAsia="Times New Roman" w:hAnsi="Times New Roman"/>
+          <w:sz w:val="24"/>
+          <w:szCs w:val="24"/>
+        </w:rPr>
+        <w:drawing>
+          <wp:inline distB="114300" distT="114300" distL="114300" distR="114300">
+            <wp:extent cx="4863206" cy="5824538"/>
+            <wp:effectExtent b="0" l="0" r="0" t="0"/>
+            <wp:docPr id="27" name="image25.png"/>
+            <a:graphic>
+              <a:graphicData uri="http://schemas.openxmlformats.org/drawingml/2006/picture">
+                <pic:pic>
+                  <pic:nvPicPr>
+                    <pic:cNvPr id="0" name="image25.png"/>
+                    <pic:cNvPicPr preferRelativeResize="0"/>
+                  </pic:nvPicPr>
+                  <pic:blipFill>
+                    <a:blip r:embed="rId42"/>
+                    <a:srcRect b="0" l="0" r="0" t="0"/>
+                    <a:stretch>
+                      <a:fillRect/>
+                    </a:stretch>
+                  </pic:blipFill>
+                  <pic:spPr>
+                    <a:xfrm>
+                      <a:off x="0" y="0"/>
+                      <a:ext cx="4863206" cy="5824538"/>
+                    </a:xfrm>
+                    <a:prstGeom prst="rect"/>
+                    <a:ln/>
+                  </pic:spPr>
+                </pic:pic>
+              </a:graphicData>
+            </a:graphic>
+          </wp:inline>
+        </w:drawing>
+      </w:r>
+      <w:r>
+        <w:rPr>
+          <w:rtl w:val="0"/>
+        </w:rPr>
+      </w:r>
+    </w:p>
+    <w:p>
+      <w:pPr>
+        <w:spacing w:line="276" w:lineRule="auto"/>
+        <w:jc w:val="center"/>
+        <w:rPr>
+          <w:rFonts w:ascii="Times New Roman" w:cs="Times New Roman" w:eastAsia="Times New Roman" w:hAnsi="Times New Roman"/>
+          <w:sz w:val="24"/>
+          <w:szCs w:val="24"/>
+        </w:rPr>
+      </w:pPr>
+      <w:r>
+        <w:rPr>
+          <w:rFonts w:ascii="Times New Roman" w:cs="Times New Roman" w:eastAsia="Times New Roman" w:hAnsi="Times New Roman"/>
+          <w:sz w:val="24"/>
+          <w:szCs w:val="24"/>
+        </w:rPr>
+        <w:drawing>
+          <wp:inline distB="114300" distT="114300" distL="114300" distR="114300">
+            <wp:extent cx="3806663" cy="2606364"/>
+            <wp:effectExtent b="0" l="0" r="0" t="0"/>
+            <wp:docPr id="30" name="image17.png"/>
+            <a:graphic>
+              <a:graphicData uri="http://schemas.openxmlformats.org/drawingml/2006/picture">
+                <pic:pic>
+                  <pic:nvPicPr>
+                    <pic:cNvPr id="0" name="image17.png"/>
+                    <pic:cNvPicPr preferRelativeResize="0"/>
+                  </pic:nvPicPr>
+                  <pic:blipFill>
+                    <a:blip r:embed="rId43"/>
+                    <a:srcRect b="0" l="0" r="0" t="0"/>
+                    <a:stretch>
+                      <a:fillRect/>
+                    </a:stretch>
+                  </pic:blipFill>
+                  <pic:spPr>
+                    <a:xfrm>
+                      <a:off x="0" y="0"/>
+                      <a:ext cx="3806663" cy="2606364"/>
+                    </a:xfrm>
+                    <a:prstGeom prst="rect"/>
+                    <a:ln/>
+                  </pic:spPr>
+                </pic:pic>
+              </a:graphicData>
+            </a:graphic>
+          </wp:inline>
+        </w:drawing>
+      </w:r>
+      <w:r>
+        <w:rPr>
+          <w:rtl w:val="0"/>
+        </w:rPr>
+      </w:r>
+    </w:p>
+    <w:p>
+      <w:pPr>
+        <w:spacing w:line="276" w:lineRule="auto"/>
+        <w:jc w:val="center"/>
+        <w:rPr>
+          <w:rFonts w:ascii="Times New Roman" w:cs="Times New Roman" w:eastAsia="Times New Roman" w:hAnsi="Times New Roman"/>
+          <w:sz w:val="24"/>
+          <w:szCs w:val="24"/>
+        </w:rPr>
+      </w:pPr>
+      <w:r>
+        <w:rPr>
+          <w:rFonts w:ascii="Times New Roman" w:cs="Times New Roman" w:eastAsia="Times New Roman" w:hAnsi="Times New Roman"/>
+          <w:sz w:val="24"/>
+          <w:szCs w:val="24"/>
+          <w:rtl w:val="0"/>
+        </w:rPr>
+        <w:t xml:space="preserve">Рис.8. Вивід програми Аналізатор місячного бюджету</w:t>
+      </w:r>
+    </w:p>
+    <w:p>
+      <w:pPr>
+        <w:spacing w:after="200" w:line="276" w:lineRule="auto"/>
+        <w:rPr>
+          <w:rFonts w:ascii="Times New Roman" w:cs="Times New Roman" w:eastAsia="Times New Roman" w:hAnsi="Times New Roman"/>
+          <w:sz w:val="24"/>
+          <w:szCs w:val="24"/>
+        </w:rPr>
+      </w:pPr>
+      <w:r>
+        <w:rPr>
+          <w:rFonts w:ascii="Times New Roman" w:cs="Times New Roman" w:eastAsia="Times New Roman" w:hAnsi="Times New Roman"/>
+          <w:sz w:val="24"/>
+          <w:szCs w:val="24"/>
+          <w:rtl w:val="0"/>
+        </w:rPr>
+        <w:t xml:space="preserve">Час затрачений на виконання завдання: 4 години</w:t>
+      </w:r>
+    </w:p>
+    <w:p>
+      <w:pPr>
+        <w:spacing w:after="200" w:line="276" w:lineRule="auto"/>
+        <w:rPr>
+          <w:rFonts w:ascii="Times New Roman" w:cs="Times New Roman" w:eastAsia="Times New Roman" w:hAnsi="Times New Roman"/>
+          <w:sz w:val="24"/>
+          <w:szCs w:val="24"/>
+        </w:rPr>
+      </w:pPr>
+      <w:r>
+        <w:rPr>
+          <w:rtl w:val="0"/>
+        </w:rPr>
       </w:r>
     </w:p>
     <w:p>
@@ -4464,16 +5218,16 @@
           <wp:inline distB="114300" distT="114300" distL="114300" distR="114300">
             <wp:extent cx="5731200" cy="1435100"/>
             <wp:effectExtent b="0" l="0" r="0" t="0"/>
-            <wp:docPr id="7" name="image7.png"/>
+            <wp:docPr id="7" name="image30.png"/>
             <a:graphic>
               <a:graphicData uri="http://schemas.openxmlformats.org/drawingml/2006/picture">
                 <pic:pic>
                   <pic:nvPicPr>
-                    <pic:cNvPr id="0" name="image7.png"/>
+                    <pic:cNvPr id="0" name="image30.png"/>
                     <pic:cNvPicPr preferRelativeResize="0"/>
                   </pic:nvPicPr>
                   <pic:blipFill>
-                    <a:blip r:embed="rId32"/>
+                    <a:blip r:embed="rId44"/>
                     <a:srcRect b="0" l="0" r="0" t="0"/>
                     <a:stretch>
                       <a:fillRect/>
@@ -4516,7 +5270,7 @@
           <w:szCs w:val="24"/>
           <w:rtl w:val="0"/>
         </w:rPr>
-        <w:t xml:space="preserve">Рис.6. Результат роботи програми Дракон і голод</w:t>
+        <w:t xml:space="preserve">Рис.9. Результат роботи програми Дракон і голод</w:t>
       </w:r>
     </w:p>
     <w:p>
@@ -4554,7 +5308,7 @@
         </w:rPr>
         <w:t xml:space="preserve">Посилання на розв’язок на Алготестері: </w:t>
       </w:r>
-      <w:hyperlink r:id="rId33">
+      <w:hyperlink r:id="rId45">
         <w:r>
           <w:rPr>
             <w:rFonts w:ascii="Times New Roman" w:cs="Times New Roman" w:eastAsia="Times New Roman" w:hAnsi="Times New Roman"/>
@@ -4617,16 +5371,16 @@
           <wp:inline distB="114300" distT="114300" distL="114300" distR="114300">
             <wp:extent cx="5734050" cy="2904376"/>
             <wp:effectExtent b="0" l="0" r="0" t="0"/>
-            <wp:docPr id="20" name="image20.png"/>
+            <wp:docPr id="22" name="image31.png"/>
             <a:graphic>
               <a:graphicData uri="http://schemas.openxmlformats.org/drawingml/2006/picture">
                 <pic:pic>
                   <pic:nvPicPr>
-                    <pic:cNvPr id="0" name="image20.png"/>
+                    <pic:cNvPr id="0" name="image31.png"/>
                     <pic:cNvPicPr preferRelativeResize="0"/>
                   </pic:nvPicPr>
                   <pic:blipFill>
-                    <a:blip r:embed="rId34"/>
+                    <a:blip r:embed="rId46"/>
                     <a:srcRect b="5287" l="0" r="0" t="4744"/>
                     <a:stretch>
                       <a:fillRect/>
@@ -4666,7 +5420,7 @@
           <w:rFonts w:ascii="Calibri" w:cs="Calibri" w:eastAsia="Calibri" w:hAnsi="Calibri"/>
           <w:rtl w:val="0"/>
         </w:rPr>
-        <w:t xml:space="preserve">Рис.7. Зустріч з командою в зумі</w:t>
+        <w:t xml:space="preserve">Рис.10. Зустріч з командою в зумі</w:t>
       </w:r>
     </w:p>
     <w:p>
@@ -4685,16 +5439,16 @@
           <wp:inline distB="114300" distT="114300" distL="114300" distR="114300">
             <wp:extent cx="5731200" cy="2527300"/>
             <wp:effectExtent b="0" l="0" r="0" t="0"/>
-            <wp:docPr id="18" name="image3.png"/>
+            <wp:docPr id="20" name="image6.png"/>
             <a:graphic>
               <a:graphicData uri="http://schemas.openxmlformats.org/drawingml/2006/picture">
                 <pic:pic>
                   <pic:nvPicPr>
-                    <pic:cNvPr id="0" name="image3.png"/>
+                    <pic:cNvPr id="0" name="image6.png"/>
                     <pic:cNvPicPr preferRelativeResize="0"/>
                   </pic:nvPicPr>
                   <pic:blipFill>
-                    <a:blip r:embed="rId35"/>
+                    <a:blip r:embed="rId47"/>
                     <a:srcRect b="0" l="0" r="0" t="0"/>
                     <a:stretch>
                       <a:fillRect/>
@@ -4734,7 +5488,7 @@
           <w:rFonts w:ascii="Calibri" w:cs="Calibri" w:eastAsia="Calibri" w:hAnsi="Calibri"/>
           <w:rtl w:val="0"/>
         </w:rPr>
-        <w:t xml:space="preserve">Рис.8. Дошка трелло часом на 22.10</w:t>
+        <w:t xml:space="preserve">Рис.11. Дошка трелло часом на 22.10</w:t>
       </w:r>
     </w:p>
     <w:p>

</xml_diff>